<commit_message>
Industry overview and Fred API setup (SQL Update)
</commit_message>
<xml_diff>
--- a/MASTER BLUEPRINT Plan Generation and API Links.docx
+++ b/MASTER BLUEPRINT Plan Generation and API Links.docx
@@ -24,6 +24,21 @@
         </w:rPr>
         <w:t xml:space="preserve"> MASTER BLUEPRINT — Business Plan Sections &amp; Data Sources</w:t>
       </w:r>
+      <w:r>
+        <w:rPr>
+          <w:b/>
+          <w:bCs/>
+        </w:rPr>
+        <w:t xml:space="preserve"> (GPT remember as </w:t>
+      </w:r>
+      <w:r>
+        <w:rPr>
+          <w:b/>
+          <w:bCs/>
+          <w:highlight w:val="yellow"/>
+        </w:rPr>
+        <w:t>Business Plan Master Blueprint</w:t>
+      </w:r>
     </w:p>
     <w:p>
       <w:r>
@@ -43,24 +58,15 @@
     </w:p>
     <w:p>
       <w:pPr>
-        <w:rPr>
-          <w:b/>
-          <w:bCs/>
-        </w:rPr>
+        <w:pStyle w:val="Heading2"/>
       </w:pPr>
       <w:r>
         <w:rPr>
           <w:rFonts w:ascii="Segoe UI Emoji" w:hAnsi="Segoe UI Emoji" w:cs="Segoe UI Emoji"/>
-          <w:b/>
-          <w:bCs/>
         </w:rPr>
         <w:t>🔵</w:t>
       </w:r>
       <w:r>
-        <w:rPr>
-          <w:b/>
-          <w:bCs/>
-        </w:rPr>
         <w:t xml:space="preserve"> SECTION 1: Executive Summary</w:t>
       </w:r>
     </w:p>
@@ -117,24 +123,15 @@
     </w:p>
     <w:p>
       <w:pPr>
-        <w:rPr>
-          <w:b/>
-          <w:bCs/>
-        </w:rPr>
+        <w:pStyle w:val="Heading2"/>
       </w:pPr>
       <w:r>
         <w:rPr>
           <w:rFonts w:ascii="Segoe UI Emoji" w:hAnsi="Segoe UI Emoji" w:cs="Segoe UI Emoji"/>
-          <w:b/>
-          <w:bCs/>
         </w:rPr>
         <w:t>🔵</w:t>
       </w:r>
       <w:r>
-        <w:rPr>
-          <w:b/>
-          <w:bCs/>
-        </w:rPr>
         <w:t xml:space="preserve"> SECTION 2: Company Overview</w:t>
       </w:r>
     </w:p>
@@ -202,24 +199,15 @@
     </w:p>
     <w:p>
       <w:pPr>
-        <w:rPr>
-          <w:b/>
-          <w:bCs/>
-        </w:rPr>
+        <w:pStyle w:val="Heading2"/>
       </w:pPr>
       <w:r>
         <w:rPr>
           <w:rFonts w:ascii="Segoe UI Emoji" w:hAnsi="Segoe UI Emoji" w:cs="Segoe UI Emoji"/>
-          <w:b/>
-          <w:bCs/>
         </w:rPr>
         <w:t>🔵</w:t>
       </w:r>
       <w:r>
-        <w:rPr>
-          <w:b/>
-          <w:bCs/>
-        </w:rPr>
         <w:t xml:space="preserve"> SECTION 3: Industry Overview</w:t>
       </w:r>
     </w:p>
@@ -298,6 +286,7 @@
         </w:numPr>
       </w:pPr>
       <w:r>
+        <w:lastRenderedPageBreak/>
         <w:t>Employment</w:t>
       </w:r>
     </w:p>
@@ -309,7 +298,6 @@
         </w:numPr>
       </w:pPr>
       <w:r>
-        <w:lastRenderedPageBreak/>
         <w:t>Industry density</w:t>
       </w:r>
     </w:p>
@@ -326,6 +314,459 @@
     </w:p>
     <w:p>
       <w:pPr>
+        <w:ind w:left="360"/>
+      </w:pPr>
+      <w:hyperlink r:id="rId5" w:history="1">
+        <w:r>
+          <w:rPr>
+            <w:rStyle w:val="Hyperlink"/>
+          </w:rPr>
+          <w:t>https://api.census.gov/data/2022/cbp?get=NAME,NAICS2017_LABEL,ESTAB,PAYANN,PAYQTR1,EMP&amp;for=state:01&amp;NAICS2017=00&amp;LFO=001&amp;EMPSZES=001&amp;key=12dfbdd601680c737e1d16dc59b0e2430</w:t>
+        </w:r>
+        <w:r>
+          <w:rPr>
+            <w:rStyle w:val="Hyperlink"/>
+          </w:rPr>
+          <w:t>4</w:t>
+        </w:r>
+        <w:r>
+          <w:rPr>
+            <w:rStyle w:val="Hyperlink"/>
+          </w:rPr>
+          <w:t>7d676b</w:t>
+        </w:r>
+      </w:hyperlink>
+    </w:p>
+    <w:tbl>
+      <w:tblPr>
+        <w:tblW w:w="0" w:type="auto"/>
+        <w:tblCellSpacing w:w="15" w:type="dxa"/>
+        <w:tblCellMar>
+          <w:top w:w="15" w:type="dxa"/>
+          <w:left w:w="15" w:type="dxa"/>
+          <w:bottom w:w="15" w:type="dxa"/>
+          <w:right w:w="15" w:type="dxa"/>
+        </w:tblCellMar>
+        <w:tblLook w:val="04A0" w:firstRow="1" w:lastRow="0" w:firstColumn="1" w:lastColumn="0" w:noHBand="0" w:noVBand="1"/>
+      </w:tblPr>
+      <w:tblGrid>
+        <w:gridCol w:w="2397"/>
+        <w:gridCol w:w="2909"/>
+      </w:tblGrid>
+      <w:tr>
+        <w:trPr>
+          <w:tblHeader/>
+          <w:tblCellSpacing w:w="15" w:type="dxa"/>
+        </w:trPr>
+        <w:tc>
+          <w:tcPr>
+            <w:tcW w:w="0" w:type="auto"/>
+            <w:vAlign w:val="center"/>
+            <w:hideMark/>
+          </w:tcPr>
+          <w:p>
+            <w:pPr>
+              <w:ind w:left="360"/>
+              <w:rPr>
+                <w:b/>
+                <w:bCs/>
+              </w:rPr>
+            </w:pPr>
+            <w:r>
+              <w:rPr>
+                <w:b/>
+                <w:bCs/>
+              </w:rPr>
+              <w:t>Parameter</w:t>
+            </w:r>
+          </w:p>
+        </w:tc>
+        <w:tc>
+          <w:tcPr>
+            <w:tcW w:w="0" w:type="auto"/>
+            <w:vAlign w:val="center"/>
+            <w:hideMark/>
+          </w:tcPr>
+          <w:p>
+            <w:pPr>
+              <w:ind w:left="360"/>
+              <w:rPr>
+                <w:b/>
+                <w:bCs/>
+              </w:rPr>
+            </w:pPr>
+            <w:r>
+              <w:rPr>
+                <w:b/>
+                <w:bCs/>
+              </w:rPr>
+              <w:t>Meaning</w:t>
+            </w:r>
+          </w:p>
+        </w:tc>
+      </w:tr>
+      <w:tr>
+        <w:trPr>
+          <w:tblCellSpacing w:w="15" w:type="dxa"/>
+        </w:trPr>
+        <w:tc>
+          <w:tcPr>
+            <w:tcW w:w="0" w:type="auto"/>
+            <w:vAlign w:val="center"/>
+            <w:hideMark/>
+          </w:tcPr>
+          <w:p>
+            <w:pPr>
+              <w:ind w:left="360"/>
+            </w:pPr>
+            <w:r>
+              <w:t>NAME</w:t>
+            </w:r>
+          </w:p>
+        </w:tc>
+        <w:tc>
+          <w:tcPr>
+            <w:tcW w:w="0" w:type="auto"/>
+            <w:vAlign w:val="center"/>
+            <w:hideMark/>
+          </w:tcPr>
+          <w:p>
+            <w:pPr>
+              <w:ind w:left="360"/>
+            </w:pPr>
+            <w:r>
+              <w:t>Returns "Alabama"</w:t>
+            </w:r>
+          </w:p>
+        </w:tc>
+      </w:tr>
+      <w:tr>
+        <w:trPr>
+          <w:tblCellSpacing w:w="15" w:type="dxa"/>
+        </w:trPr>
+        <w:tc>
+          <w:tcPr>
+            <w:tcW w:w="0" w:type="auto"/>
+            <w:vAlign w:val="center"/>
+            <w:hideMark/>
+          </w:tcPr>
+          <w:p>
+            <w:pPr>
+              <w:ind w:left="360"/>
+            </w:pPr>
+            <w:r>
+              <w:t>NAICS2017_LABEL</w:t>
+            </w:r>
+          </w:p>
+        </w:tc>
+        <w:tc>
+          <w:tcPr>
+            <w:tcW w:w="0" w:type="auto"/>
+            <w:vAlign w:val="center"/>
+            <w:hideMark/>
+          </w:tcPr>
+          <w:p>
+            <w:pPr>
+              <w:ind w:left="360"/>
+            </w:pPr>
+            <w:r>
+              <w:t>Industry name</w:t>
+            </w:r>
+          </w:p>
+        </w:tc>
+      </w:tr>
+      <w:tr>
+        <w:trPr>
+          <w:tblCellSpacing w:w="15" w:type="dxa"/>
+        </w:trPr>
+        <w:tc>
+          <w:tcPr>
+            <w:tcW w:w="0" w:type="auto"/>
+            <w:vAlign w:val="center"/>
+            <w:hideMark/>
+          </w:tcPr>
+          <w:p>
+            <w:pPr>
+              <w:ind w:left="360"/>
+            </w:pPr>
+            <w:r>
+              <w:t>ESTAB</w:t>
+            </w:r>
+          </w:p>
+        </w:tc>
+        <w:tc>
+          <w:tcPr>
+            <w:tcW w:w="0" w:type="auto"/>
+            <w:vAlign w:val="center"/>
+            <w:hideMark/>
+          </w:tcPr>
+          <w:p>
+            <w:pPr>
+              <w:ind w:left="360"/>
+            </w:pPr>
+            <w:r>
+              <w:t>Total establishments</w:t>
+            </w:r>
+          </w:p>
+        </w:tc>
+      </w:tr>
+      <w:tr>
+        <w:trPr>
+          <w:tblCellSpacing w:w="15" w:type="dxa"/>
+        </w:trPr>
+        <w:tc>
+          <w:tcPr>
+            <w:tcW w:w="0" w:type="auto"/>
+            <w:vAlign w:val="center"/>
+            <w:hideMark/>
+          </w:tcPr>
+          <w:p>
+            <w:pPr>
+              <w:ind w:left="360"/>
+            </w:pPr>
+            <w:r>
+              <w:t>PAYANN</w:t>
+            </w:r>
+          </w:p>
+        </w:tc>
+        <w:tc>
+          <w:tcPr>
+            <w:tcW w:w="0" w:type="auto"/>
+            <w:vAlign w:val="center"/>
+            <w:hideMark/>
+          </w:tcPr>
+          <w:p>
+            <w:pPr>
+              <w:ind w:left="360"/>
+            </w:pPr>
+            <w:r>
+              <w:t>Annual payroll</w:t>
+            </w:r>
+          </w:p>
+        </w:tc>
+      </w:tr>
+      <w:tr>
+        <w:trPr>
+          <w:tblCellSpacing w:w="15" w:type="dxa"/>
+        </w:trPr>
+        <w:tc>
+          <w:tcPr>
+            <w:tcW w:w="0" w:type="auto"/>
+            <w:vAlign w:val="center"/>
+            <w:hideMark/>
+          </w:tcPr>
+          <w:p>
+            <w:pPr>
+              <w:ind w:left="360"/>
+            </w:pPr>
+            <w:r>
+              <w:t>PAYQTR1</w:t>
+            </w:r>
+          </w:p>
+        </w:tc>
+        <w:tc>
+          <w:tcPr>
+            <w:tcW w:w="0" w:type="auto"/>
+            <w:vAlign w:val="center"/>
+            <w:hideMark/>
+          </w:tcPr>
+          <w:p>
+            <w:pPr>
+              <w:ind w:left="360"/>
+            </w:pPr>
+            <w:r>
+              <w:t>Q1 payroll</w:t>
+            </w:r>
+          </w:p>
+        </w:tc>
+      </w:tr>
+      <w:tr>
+        <w:trPr>
+          <w:tblCellSpacing w:w="15" w:type="dxa"/>
+        </w:trPr>
+        <w:tc>
+          <w:tcPr>
+            <w:tcW w:w="0" w:type="auto"/>
+            <w:vAlign w:val="center"/>
+            <w:hideMark/>
+          </w:tcPr>
+          <w:p>
+            <w:pPr>
+              <w:ind w:left="360"/>
+            </w:pPr>
+            <w:r>
+              <w:t>EMP</w:t>
+            </w:r>
+          </w:p>
+        </w:tc>
+        <w:tc>
+          <w:tcPr>
+            <w:tcW w:w="0" w:type="auto"/>
+            <w:vAlign w:val="center"/>
+            <w:hideMark/>
+          </w:tcPr>
+          <w:p>
+            <w:pPr>
+              <w:ind w:left="360"/>
+            </w:pPr>
+            <w:r>
+              <w:t>Total employment</w:t>
+            </w:r>
+          </w:p>
+        </w:tc>
+      </w:tr>
+      <w:tr>
+        <w:trPr>
+          <w:tblCellSpacing w:w="15" w:type="dxa"/>
+        </w:trPr>
+        <w:tc>
+          <w:tcPr>
+            <w:tcW w:w="0" w:type="auto"/>
+            <w:vAlign w:val="center"/>
+            <w:hideMark/>
+          </w:tcPr>
+          <w:p>
+            <w:pPr>
+              <w:ind w:left="360"/>
+            </w:pPr>
+            <w:r>
+              <w:t>for=state:01</w:t>
+            </w:r>
+          </w:p>
+        </w:tc>
+        <w:tc>
+          <w:tcPr>
+            <w:tcW w:w="0" w:type="auto"/>
+            <w:vAlign w:val="center"/>
+            <w:hideMark/>
+          </w:tcPr>
+          <w:p>
+            <w:pPr>
+              <w:ind w:left="360"/>
+            </w:pPr>
+            <w:r>
+              <w:t>Alabama</w:t>
+            </w:r>
+          </w:p>
+        </w:tc>
+      </w:tr>
+      <w:tr>
+        <w:trPr>
+          <w:tblCellSpacing w:w="15" w:type="dxa"/>
+        </w:trPr>
+        <w:tc>
+          <w:tcPr>
+            <w:tcW w:w="0" w:type="auto"/>
+            <w:vAlign w:val="center"/>
+            <w:hideMark/>
+          </w:tcPr>
+          <w:p>
+            <w:pPr>
+              <w:ind w:left="360"/>
+            </w:pPr>
+            <w:r>
+              <w:t>NAICS2017=00</w:t>
+            </w:r>
+          </w:p>
+        </w:tc>
+        <w:tc>
+          <w:tcPr>
+            <w:tcW w:w="0" w:type="auto"/>
+            <w:vAlign w:val="center"/>
+            <w:hideMark/>
+          </w:tcPr>
+          <w:p>
+            <w:pPr>
+              <w:ind w:left="360"/>
+            </w:pPr>
+            <w:r>
+              <w:rPr>
+                <w:b/>
+                <w:bCs/>
+              </w:rPr>
+              <w:t>Total for ALL industries</w:t>
+            </w:r>
+          </w:p>
+        </w:tc>
+      </w:tr>
+      <w:tr>
+        <w:trPr>
+          <w:tblCellSpacing w:w="15" w:type="dxa"/>
+        </w:trPr>
+        <w:tc>
+          <w:tcPr>
+            <w:tcW w:w="0" w:type="auto"/>
+            <w:vAlign w:val="center"/>
+            <w:hideMark/>
+          </w:tcPr>
+          <w:p>
+            <w:pPr>
+              <w:ind w:left="360"/>
+            </w:pPr>
+            <w:r>
+              <w:t>LFO=001</w:t>
+            </w:r>
+          </w:p>
+        </w:tc>
+        <w:tc>
+          <w:tcPr>
+            <w:tcW w:w="0" w:type="auto"/>
+            <w:vAlign w:val="center"/>
+            <w:hideMark/>
+          </w:tcPr>
+          <w:p>
+            <w:pPr>
+              <w:ind w:left="360"/>
+            </w:pPr>
+            <w:r>
+              <w:t>All legal forms</w:t>
+            </w:r>
+          </w:p>
+        </w:tc>
+      </w:tr>
+      <w:tr>
+        <w:trPr>
+          <w:tblCellSpacing w:w="15" w:type="dxa"/>
+        </w:trPr>
+        <w:tc>
+          <w:tcPr>
+            <w:tcW w:w="0" w:type="auto"/>
+            <w:vAlign w:val="center"/>
+            <w:hideMark/>
+          </w:tcPr>
+          <w:p>
+            <w:pPr>
+              <w:ind w:left="360"/>
+            </w:pPr>
+            <w:r>
+              <w:t>EMPSZES=001</w:t>
+            </w:r>
+          </w:p>
+        </w:tc>
+        <w:tc>
+          <w:tcPr>
+            <w:tcW w:w="0" w:type="auto"/>
+            <w:vAlign w:val="center"/>
+            <w:hideMark/>
+          </w:tcPr>
+          <w:p>
+            <w:pPr>
+              <w:ind w:left="360"/>
+            </w:pPr>
+            <w:r>
+              <w:t>All employment sizes</w:t>
+            </w:r>
+          </w:p>
+        </w:tc>
+      </w:tr>
+    </w:tbl>
+    <w:p>
+      <w:pPr>
+        <w:ind w:left="360"/>
+      </w:pPr>
+    </w:p>
+    <w:p>
+      <w:pPr>
         <w:rPr>
           <w:b/>
           <w:bCs/>
@@ -381,6 +822,46 @@
       </w:r>
     </w:p>
     <w:p>
+      <w:r>
+        <w:t>Annual file upload: all_data_M_2024</w:t>
+      </w:r>
+    </w:p>
+    <w:p>
+      <w:hyperlink r:id="rId6" w:history="1">
+        <w:r>
+          <w:rPr>
+            <w:rStyle w:val="Hyperlink"/>
+          </w:rPr>
+          <w:t>https://www.bls.gov/oes/tables.htm</w:t>
+        </w:r>
+      </w:hyperlink>
+    </w:p>
+    <w:p>
+      <w:r>
+        <w:t xml:space="preserve">load script: </w:t>
+      </w:r>
+      <w:r>
+        <w:t>bls_employment_wages_loader.py</w:t>
+      </w:r>
+    </w:p>
+    <w:p>
+      <w:proofErr w:type="spellStart"/>
+      <w:r>
+        <w:lastRenderedPageBreak/>
+        <w:t>sql</w:t>
+      </w:r>
+      <w:proofErr w:type="spellEnd"/>
+      <w:r>
+        <w:t xml:space="preserve"> table: </w:t>
+      </w:r>
+      <w:proofErr w:type="spellStart"/>
+      <w:r>
+        <w:t>oews_state_wages</w:t>
+      </w:r>
+      <w:proofErr w:type="spellEnd"/>
+    </w:p>
+    <w:p/>
+    <w:p>
       <w:pPr>
         <w:rPr>
           <w:b/>
@@ -437,6 +918,36 @@
       </w:r>
     </w:p>
     <w:p>
+      <w:r>
+        <w:t xml:space="preserve">Update every two months on scheduled job in </w:t>
+      </w:r>
+      <w:proofErr w:type="spellStart"/>
+      <w:r>
+        <w:t>pythonanywhere</w:t>
+      </w:r>
+      <w:proofErr w:type="spellEnd"/>
+    </w:p>
+    <w:p>
+      <w:r>
+        <w:t xml:space="preserve">SQL table: </w:t>
+      </w:r>
+      <w:proofErr w:type="spellStart"/>
+      <w:r>
+        <w:t>fred_macro_quarterly</w:t>
+      </w:r>
+      <w:proofErr w:type="spellEnd"/>
+    </w:p>
+    <w:p>
+      <w:r>
+        <w:t xml:space="preserve">Script: </w:t>
+      </w:r>
+      <w:proofErr w:type="spellStart"/>
+      <w:r>
+        <w:t>fred_macro_loader</w:t>
+      </w:r>
+      <w:proofErr w:type="spellEnd"/>
+    </w:p>
+    <w:p>
       <w:pPr>
         <w:numPr>
           <w:ilvl w:val="0"/>
@@ -446,28 +957,15 @@
       <w:r>
         <w:t>Sector indices (if relevant)</w:t>
       </w:r>
-    </w:p>
-    <w:p>
-      <w:pPr>
-        <w:rPr>
-          <w:b/>
-          <w:bCs/>
-        </w:rPr>
-      </w:pPr>
-      <w:r>
-        <w:rPr>
-          <w:rFonts w:ascii="Segoe UI Symbol" w:hAnsi="Segoe UI Symbol" w:cs="Segoe UI Symbol"/>
-          <w:b/>
-          <w:bCs/>
-        </w:rPr>
-        <w:t>✔</w:t>
-      </w:r>
-      <w:r>
-        <w:rPr>
-          <w:b/>
-          <w:bCs/>
-        </w:rPr>
-        <w:t xml:space="preserve"> Your 6-digit → 3-digit NAICS mapping</w:t>
+      <w:r>
+        <w:t xml:space="preserve"> using </w:t>
+      </w:r>
+      <w:r>
+        <w:rPr>
+          <w:b/>
+          <w:bCs/>
+        </w:rPr>
+        <w:t>3-digit NAICS mapping</w:t>
       </w:r>
     </w:p>
     <w:p>
@@ -479,24 +977,15 @@
     </w:p>
     <w:p>
       <w:pPr>
-        <w:rPr>
-          <w:b/>
-          <w:bCs/>
-        </w:rPr>
+        <w:pStyle w:val="Heading2"/>
       </w:pPr>
       <w:r>
         <w:rPr>
           <w:rFonts w:ascii="Segoe UI Emoji" w:hAnsi="Segoe UI Emoji" w:cs="Segoe UI Emoji"/>
-          <w:b/>
-          <w:bCs/>
         </w:rPr>
         <w:t>🔵</w:t>
       </w:r>
       <w:r>
-        <w:rPr>
-          <w:b/>
-          <w:bCs/>
-        </w:rPr>
         <w:t xml:space="preserve"> SECTION 4: Market Analysis</w:t>
       </w:r>
     </w:p>
@@ -630,7 +1119,6 @@
         </w:numPr>
       </w:pPr>
       <w:r>
-        <w:lastRenderedPageBreak/>
         <w:t>Housing characteristics</w:t>
       </w:r>
     </w:p>
@@ -665,6 +1153,7 @@
         </w:numPr>
       </w:pPr>
       <w:r>
+        <w:lastRenderedPageBreak/>
         <w:t>Gets state/county FIPS</w:t>
       </w:r>
     </w:p>
@@ -706,7 +1195,13 @@
           <w:b/>
           <w:bCs/>
         </w:rPr>
-        <w:t xml:space="preserve"> SECTION 5: Local Competitive Landscape</w:t>
+        <w:t xml:space="preserve"> </w:t>
+      </w:r>
+      <w:r>
+        <w:rPr>
+          <w:rStyle w:val="Heading2Char"/>
+        </w:rPr>
+        <w:t>SECTION 5: Local Competitive Landscape</w:t>
       </w:r>
     </w:p>
     <w:p>
@@ -937,7 +1432,13 @@
           <w:b/>
           <w:bCs/>
         </w:rPr>
-        <w:t xml:space="preserve"> SECTION 6: Customer Segmentation</w:t>
+        <w:t xml:space="preserve"> </w:t>
+      </w:r>
+      <w:r>
+        <w:rPr>
+          <w:rStyle w:val="Heading2Char"/>
+        </w:rPr>
+        <w:t>SECTION 6: Customer Segmentation</w:t>
       </w:r>
     </w:p>
     <w:p>
@@ -959,7 +1460,6 @@
           <w:b/>
           <w:bCs/>
         </w:rPr>
-        <w:lastRenderedPageBreak/>
         <w:t>Data sources:</w:t>
       </w:r>
     </w:p>
@@ -994,6 +1494,7 @@
         </w:numPr>
       </w:pPr>
       <w:r>
+        <w:lastRenderedPageBreak/>
         <w:t>Age</w:t>
       </w:r>
     </w:p>
@@ -1119,8 +1620,7 @@
     <w:p>
       <w:pPr>
         <w:rPr>
-          <w:b/>
-          <w:bCs/>
+          <w:rStyle w:val="Heading2Char"/>
         </w:rPr>
       </w:pPr>
       <w:r>
@@ -1136,7 +1636,13 @@
           <w:b/>
           <w:bCs/>
         </w:rPr>
-        <w:t xml:space="preserve"> SECTION 7: Marketing Strategy</w:t>
+        <w:t xml:space="preserve"> </w:t>
+      </w:r>
+      <w:r>
+        <w:rPr>
+          <w:rStyle w:val="Heading2Char"/>
+        </w:rPr>
+        <w:t>SECTION 7: Marketing Strategy</w:t>
       </w:r>
     </w:p>
     <w:p>
@@ -1299,16 +1805,21 @@
           <w:b/>
           <w:bCs/>
         </w:rPr>
-        <w:t xml:space="preserve"> SECTION 8: Operations Plan</w:t>
-      </w:r>
-    </w:p>
-    <w:p>
-      <w:r>
-        <w:rPr>
-          <w:b/>
-          <w:bCs/>
-        </w:rPr>
-        <w:lastRenderedPageBreak/>
+        <w:t xml:space="preserve"> </w:t>
+      </w:r>
+      <w:r>
+        <w:rPr>
+          <w:rStyle w:val="Heading2Char"/>
+        </w:rPr>
+        <w:t>SECTION 8: Operations Plan</w:t>
+      </w:r>
+    </w:p>
+    <w:p>
+      <w:r>
+        <w:rPr>
+          <w:b/>
+          <w:bCs/>
+        </w:rPr>
         <w:t>Purpose:</w:t>
       </w:r>
       <w:r>
@@ -1322,6 +1833,7 @@
           <w:b/>
           <w:bCs/>
         </w:rPr>
+        <w:lastRenderedPageBreak/>
         <w:t>Data sources:</w:t>
       </w:r>
     </w:p>
@@ -1503,8 +2015,7 @@
     <w:p>
       <w:pPr>
         <w:rPr>
-          <w:b/>
-          <w:bCs/>
+          <w:rStyle w:val="Heading2Char"/>
         </w:rPr>
       </w:pPr>
       <w:r>
@@ -1520,7 +2031,13 @@
           <w:b/>
           <w:bCs/>
         </w:rPr>
-        <w:t xml:space="preserve"> SECTION 9: Management &amp; Staffing</w:t>
+        <w:t xml:space="preserve"> </w:t>
+      </w:r>
+      <w:r>
+        <w:rPr>
+          <w:rStyle w:val="Heading2Char"/>
+        </w:rPr>
+        <w:t>SECTION 9: Management &amp; Staffing</w:t>
       </w:r>
     </w:p>
     <w:p>
@@ -1633,25 +2150,16 @@
     </w:p>
     <w:p>
       <w:pPr>
-        <w:rPr>
-          <w:b/>
-          <w:bCs/>
-        </w:rPr>
+        <w:pStyle w:val="Heading2"/>
       </w:pPr>
       <w:r>
         <w:rPr>
           <w:rFonts w:ascii="Segoe UI Emoji" w:hAnsi="Segoe UI Emoji" w:cs="Segoe UI Emoji"/>
-          <w:b/>
-          <w:bCs/>
         </w:rPr>
         <w:lastRenderedPageBreak/>
         <w:t>🔵</w:t>
       </w:r>
       <w:r>
-        <w:rPr>
-          <w:b/>
-          <w:bCs/>
-        </w:rPr>
         <w:t xml:space="preserve"> SECTION 10: Financial Plan</w:t>
       </w:r>
     </w:p>
@@ -1943,24 +2451,16 @@
     </w:p>
     <w:p>
       <w:pPr>
-        <w:rPr>
-          <w:b/>
-          <w:bCs/>
-        </w:rPr>
+        <w:pStyle w:val="Heading2"/>
       </w:pPr>
       <w:r>
         <w:rPr>
           <w:rFonts w:ascii="Segoe UI Emoji" w:hAnsi="Segoe UI Emoji" w:cs="Segoe UI Emoji"/>
-          <w:b/>
-          <w:bCs/>
-        </w:rPr>
+        </w:rPr>
+        <w:lastRenderedPageBreak/>
         <w:t>🔵</w:t>
       </w:r>
       <w:r>
-        <w:rPr>
-          <w:b/>
-          <w:bCs/>
-        </w:rPr>
         <w:t xml:space="preserve"> SECTION 11: Funding Request (optional)</w:t>
       </w:r>
     </w:p>
@@ -1970,7 +2470,6 @@
           <w:b/>
           <w:bCs/>
         </w:rPr>
-        <w:lastRenderedPageBreak/>
         <w:t>Purpose:</w:t>
       </w:r>
       <w:r>
@@ -2010,6 +2509,17 @@
       </w:r>
     </w:p>
     <w:p>
+      <w:pPr>
+        <w:numPr>
+          <w:ilvl w:val="0"/>
+          <w:numId w:val="24"/>
+        </w:numPr>
+      </w:pPr>
+      <w:r>
+        <w:t>SBA API</w:t>
+      </w:r>
+    </w:p>
+    <w:p>
       <w:r>
         <w:pict w14:anchorId="341848DE">
           <v:rect id="_x0000_i1114" style="width:0;height:1.5pt" o:hralign="center" o:hrstd="t" o:hr="t" fillcolor="#a0a0a0" stroked="f"/>
@@ -2018,24 +2528,15 @@
     </w:p>
     <w:p>
       <w:pPr>
-        <w:rPr>
-          <w:b/>
-          <w:bCs/>
-        </w:rPr>
+        <w:pStyle w:val="Heading2"/>
       </w:pPr>
       <w:r>
         <w:rPr>
           <w:rFonts w:ascii="Segoe UI Emoji" w:hAnsi="Segoe UI Emoji" w:cs="Segoe UI Emoji"/>
-          <w:b/>
-          <w:bCs/>
         </w:rPr>
         <w:t>🔵</w:t>
       </w:r>
       <w:r>
-        <w:rPr>
-          <w:b/>
-          <w:bCs/>
-        </w:rPr>
         <w:t xml:space="preserve"> SECTION 12: Appendix</w:t>
       </w:r>
     </w:p>
@@ -2137,8 +2638,7 @@
     <w:p>
       <w:pPr>
         <w:rPr>
-          <w:b/>
-          <w:bCs/>
+          <w:rStyle w:val="Heading2Char"/>
         </w:rPr>
       </w:pPr>
       <w:r>
@@ -2154,7 +2654,13 @@
           <w:b/>
           <w:bCs/>
         </w:rPr>
-        <w:t xml:space="preserve"> FULL MASTER TABLE (SUMMARY)</w:t>
+        <w:t xml:space="preserve"> </w:t>
+      </w:r>
+      <w:r>
+        <w:rPr>
+          <w:rStyle w:val="Heading2Char"/>
+        </w:rPr>
+        <w:t>FULL MASTER TABLE (SUMMARY)</w:t>
       </w:r>
     </w:p>
     <w:tbl>
@@ -2381,6 +2887,7 @@
           </w:tcPr>
           <w:p>
             <w:r>
+              <w:lastRenderedPageBreak/>
               <w:t>Market Analysis</w:t>
             </w:r>
           </w:p>
@@ -2422,7 +2929,6 @@
           </w:tcPr>
           <w:p>
             <w:r>
-              <w:lastRenderedPageBreak/>
               <w:t>Competitive Landscape</w:t>
             </w:r>
           </w:p>
@@ -5436,6 +5942,155 @@
     </w:lvl>
   </w:abstractNum>
   <w:abstractNum w:abstractNumId="18" w15:restartNumberingAfterBreak="0">
+    <w:nsid w:val="50A63E48"/>
+    <w:multiLevelType w:val="multilevel"/>
+    <w:tmpl w:val="25A81982"/>
+    <w:lvl w:ilvl="0">
+      <w:start w:val="1"/>
+      <w:numFmt w:val="bullet"/>
+      <w:lvlText w:val=""/>
+      <w:lvlJc w:val="left"/>
+      <w:pPr>
+        <w:tabs>
+          <w:tab w:val="num" w:pos="720"/>
+        </w:tabs>
+        <w:ind w:left="720" w:hanging="360"/>
+      </w:pPr>
+      <w:rPr>
+        <w:rFonts w:ascii="Symbol" w:hAnsi="Symbol" w:hint="default"/>
+        <w:sz w:val="20"/>
+      </w:rPr>
+    </w:lvl>
+    <w:lvl w:ilvl="1" w:tentative="1">
+      <w:start w:val="1"/>
+      <w:numFmt w:val="bullet"/>
+      <w:lvlText w:val="o"/>
+      <w:lvlJc w:val="left"/>
+      <w:pPr>
+        <w:tabs>
+          <w:tab w:val="num" w:pos="1440"/>
+        </w:tabs>
+        <w:ind w:left="1440" w:hanging="360"/>
+      </w:pPr>
+      <w:rPr>
+        <w:rFonts w:ascii="Courier New" w:hAnsi="Courier New" w:hint="default"/>
+        <w:sz w:val="20"/>
+      </w:rPr>
+    </w:lvl>
+    <w:lvl w:ilvl="2" w:tentative="1">
+      <w:start w:val="1"/>
+      <w:numFmt w:val="bullet"/>
+      <w:lvlText w:val=""/>
+      <w:lvlJc w:val="left"/>
+      <w:pPr>
+        <w:tabs>
+          <w:tab w:val="num" w:pos="2160"/>
+        </w:tabs>
+        <w:ind w:left="2160" w:hanging="360"/>
+      </w:pPr>
+      <w:rPr>
+        <w:rFonts w:ascii="Wingdings" w:hAnsi="Wingdings" w:hint="default"/>
+        <w:sz w:val="20"/>
+      </w:rPr>
+    </w:lvl>
+    <w:lvl w:ilvl="3" w:tentative="1">
+      <w:start w:val="1"/>
+      <w:numFmt w:val="bullet"/>
+      <w:lvlText w:val=""/>
+      <w:lvlJc w:val="left"/>
+      <w:pPr>
+        <w:tabs>
+          <w:tab w:val="num" w:pos="2880"/>
+        </w:tabs>
+        <w:ind w:left="2880" w:hanging="360"/>
+      </w:pPr>
+      <w:rPr>
+        <w:rFonts w:ascii="Wingdings" w:hAnsi="Wingdings" w:hint="default"/>
+        <w:sz w:val="20"/>
+      </w:rPr>
+    </w:lvl>
+    <w:lvl w:ilvl="4" w:tentative="1">
+      <w:start w:val="1"/>
+      <w:numFmt w:val="bullet"/>
+      <w:lvlText w:val=""/>
+      <w:lvlJc w:val="left"/>
+      <w:pPr>
+        <w:tabs>
+          <w:tab w:val="num" w:pos="3600"/>
+        </w:tabs>
+        <w:ind w:left="3600" w:hanging="360"/>
+      </w:pPr>
+      <w:rPr>
+        <w:rFonts w:ascii="Wingdings" w:hAnsi="Wingdings" w:hint="default"/>
+        <w:sz w:val="20"/>
+      </w:rPr>
+    </w:lvl>
+    <w:lvl w:ilvl="5" w:tentative="1">
+      <w:start w:val="1"/>
+      <w:numFmt w:val="bullet"/>
+      <w:lvlText w:val=""/>
+      <w:lvlJc w:val="left"/>
+      <w:pPr>
+        <w:tabs>
+          <w:tab w:val="num" w:pos="4320"/>
+        </w:tabs>
+        <w:ind w:left="4320" w:hanging="360"/>
+      </w:pPr>
+      <w:rPr>
+        <w:rFonts w:ascii="Wingdings" w:hAnsi="Wingdings" w:hint="default"/>
+        <w:sz w:val="20"/>
+      </w:rPr>
+    </w:lvl>
+    <w:lvl w:ilvl="6" w:tentative="1">
+      <w:start w:val="1"/>
+      <w:numFmt w:val="bullet"/>
+      <w:lvlText w:val=""/>
+      <w:lvlJc w:val="left"/>
+      <w:pPr>
+        <w:tabs>
+          <w:tab w:val="num" w:pos="5040"/>
+        </w:tabs>
+        <w:ind w:left="5040" w:hanging="360"/>
+      </w:pPr>
+      <w:rPr>
+        <w:rFonts w:ascii="Wingdings" w:hAnsi="Wingdings" w:hint="default"/>
+        <w:sz w:val="20"/>
+      </w:rPr>
+    </w:lvl>
+    <w:lvl w:ilvl="7" w:tentative="1">
+      <w:start w:val="1"/>
+      <w:numFmt w:val="bullet"/>
+      <w:lvlText w:val=""/>
+      <w:lvlJc w:val="left"/>
+      <w:pPr>
+        <w:tabs>
+          <w:tab w:val="num" w:pos="5760"/>
+        </w:tabs>
+        <w:ind w:left="5760" w:hanging="360"/>
+      </w:pPr>
+      <w:rPr>
+        <w:rFonts w:ascii="Wingdings" w:hAnsi="Wingdings" w:hint="default"/>
+        <w:sz w:val="20"/>
+      </w:rPr>
+    </w:lvl>
+    <w:lvl w:ilvl="8" w:tentative="1">
+      <w:start w:val="1"/>
+      <w:numFmt w:val="bullet"/>
+      <w:lvlText w:val=""/>
+      <w:lvlJc w:val="left"/>
+      <w:pPr>
+        <w:tabs>
+          <w:tab w:val="num" w:pos="6480"/>
+        </w:tabs>
+        <w:ind w:left="6480" w:hanging="360"/>
+      </w:pPr>
+      <w:rPr>
+        <w:rFonts w:ascii="Wingdings" w:hAnsi="Wingdings" w:hint="default"/>
+        <w:sz w:val="20"/>
+      </w:rPr>
+    </w:lvl>
+  </w:abstractNum>
+  <w:abstractNum w:abstractNumId="19" w15:restartNumberingAfterBreak="0">
     <w:nsid w:val="54A75DF3"/>
     <w:multiLevelType w:val="multilevel"/>
     <w:tmpl w:val="0E02BE0E"/>
@@ -5584,7 +6239,7 @@
       </w:rPr>
     </w:lvl>
   </w:abstractNum>
-  <w:abstractNum w:abstractNumId="19" w15:restartNumberingAfterBreak="0">
+  <w:abstractNum w:abstractNumId="20" w15:restartNumberingAfterBreak="0">
     <w:nsid w:val="57F774CB"/>
     <w:multiLevelType w:val="multilevel"/>
     <w:tmpl w:val="B7D6391A"/>
@@ -5733,7 +6388,7 @@
       </w:rPr>
     </w:lvl>
   </w:abstractNum>
-  <w:abstractNum w:abstractNumId="20" w15:restartNumberingAfterBreak="0">
+  <w:abstractNum w:abstractNumId="21" w15:restartNumberingAfterBreak="0">
     <w:nsid w:val="58405EFD"/>
     <w:multiLevelType w:val="multilevel"/>
     <w:tmpl w:val="A2A2935A"/>
@@ -5882,7 +6537,7 @@
       </w:rPr>
     </w:lvl>
   </w:abstractNum>
-  <w:abstractNum w:abstractNumId="21" w15:restartNumberingAfterBreak="0">
+  <w:abstractNum w:abstractNumId="22" w15:restartNumberingAfterBreak="0">
     <w:nsid w:val="603B0B6A"/>
     <w:multiLevelType w:val="multilevel"/>
     <w:tmpl w:val="48FECAD0"/>
@@ -6031,7 +6686,7 @@
       </w:rPr>
     </w:lvl>
   </w:abstractNum>
-  <w:abstractNum w:abstractNumId="22" w15:restartNumberingAfterBreak="0">
+  <w:abstractNum w:abstractNumId="23" w15:restartNumberingAfterBreak="0">
     <w:nsid w:val="631D1CE0"/>
     <w:multiLevelType w:val="multilevel"/>
     <w:tmpl w:val="FAAC53F4"/>
@@ -6180,7 +6835,7 @@
       </w:rPr>
     </w:lvl>
   </w:abstractNum>
-  <w:abstractNum w:abstractNumId="23" w15:restartNumberingAfterBreak="0">
+  <w:abstractNum w:abstractNumId="24" w15:restartNumberingAfterBreak="0">
     <w:nsid w:val="75AF0EA9"/>
     <w:multiLevelType w:val="multilevel"/>
     <w:tmpl w:val="26C01B0E"/>
@@ -6329,7 +6984,7 @@
       </w:rPr>
     </w:lvl>
   </w:abstractNum>
-  <w:abstractNum w:abstractNumId="24" w15:restartNumberingAfterBreak="0">
+  <w:abstractNum w:abstractNumId="25" w15:restartNumberingAfterBreak="0">
     <w:nsid w:val="77DD1A8B"/>
     <w:multiLevelType w:val="multilevel"/>
     <w:tmpl w:val="F738D09E"/>
@@ -6479,7 +7134,7 @@
     </w:lvl>
   </w:abstractNum>
   <w:num w:numId="1" w16cid:durableId="831682021">
-    <w:abstractNumId w:val="20"/>
+    <w:abstractNumId w:val="21"/>
   </w:num>
   <w:num w:numId="2" w16cid:durableId="1816605163">
     <w:abstractNumId w:val="2"/>
@@ -6488,7 +7143,7 @@
     <w:abstractNumId w:val="10"/>
   </w:num>
   <w:num w:numId="4" w16cid:durableId="1718046538">
-    <w:abstractNumId w:val="18"/>
+    <w:abstractNumId w:val="19"/>
   </w:num>
   <w:num w:numId="5" w16cid:durableId="679350624">
     <w:abstractNumId w:val="4"/>
@@ -6500,19 +7155,19 @@
     <w:abstractNumId w:val="9"/>
   </w:num>
   <w:num w:numId="8" w16cid:durableId="1613171596">
-    <w:abstractNumId w:val="24"/>
+    <w:abstractNumId w:val="25"/>
   </w:num>
   <w:num w:numId="9" w16cid:durableId="1436942454">
     <w:abstractNumId w:val="5"/>
   </w:num>
   <w:num w:numId="10" w16cid:durableId="431701870">
-    <w:abstractNumId w:val="21"/>
+    <w:abstractNumId w:val="22"/>
   </w:num>
   <w:num w:numId="11" w16cid:durableId="393047876">
     <w:abstractNumId w:val="7"/>
   </w:num>
   <w:num w:numId="12" w16cid:durableId="204634435">
-    <w:abstractNumId w:val="19"/>
+    <w:abstractNumId w:val="20"/>
   </w:num>
   <w:num w:numId="13" w16cid:durableId="532764996">
     <w:abstractNumId w:val="17"/>
@@ -6533,7 +7188,7 @@
     <w:abstractNumId w:val="3"/>
   </w:num>
   <w:num w:numId="19" w16cid:durableId="205945739">
-    <w:abstractNumId w:val="22"/>
+    <w:abstractNumId w:val="23"/>
   </w:num>
   <w:num w:numId="20" w16cid:durableId="1552499837">
     <w:abstractNumId w:val="13"/>
@@ -6551,7 +7206,10 @@
     <w:abstractNumId w:val="0"/>
   </w:num>
   <w:num w:numId="25" w16cid:durableId="595599404">
-    <w:abstractNumId w:val="23"/>
+    <w:abstractNumId w:val="24"/>
+  </w:num>
+  <w:num w:numId="26" w16cid:durableId="1844969773">
+    <w:abstractNumId w:val="18"/>
   </w:num>
 </w:numbering>
 </file>
@@ -6984,7 +7642,6 @@
     <w:next w:val="Normal"/>
     <w:link w:val="Heading2Char"/>
     <w:uiPriority w:val="9"/>
-    <w:semiHidden/>
     <w:unhideWhenUsed/>
     <w:qFormat/>
     <w:rsid w:val="005B32B9"/>
@@ -7200,7 +7857,6 @@
     <w:basedOn w:val="DefaultParagraphFont"/>
     <w:link w:val="Heading2"/>
     <w:uiPriority w:val="9"/>
-    <w:semiHidden/>
     <w:rsid w:val="005B32B9"/>
     <w:rPr>
       <w:rFonts w:asciiTheme="majorHAnsi" w:eastAsiaTheme="majorEastAsia" w:hAnsiTheme="majorHAnsi" w:cstheme="majorBidi"/>
@@ -7470,6 +8126,41 @@
       <w:smallCaps/>
       <w:color w:val="0F4761" w:themeColor="accent1" w:themeShade="BF"/>
       <w:spacing w:val="5"/>
+    </w:rPr>
+  </w:style>
+  <w:style w:type="character" w:styleId="Hyperlink">
+    <w:name w:val="Hyperlink"/>
+    <w:basedOn w:val="DefaultParagraphFont"/>
+    <w:uiPriority w:val="99"/>
+    <w:unhideWhenUsed/>
+    <w:rsid w:val="005E59CC"/>
+    <w:rPr>
+      <w:color w:val="467886" w:themeColor="hyperlink"/>
+      <w:u w:val="single"/>
+    </w:rPr>
+  </w:style>
+  <w:style w:type="character" w:styleId="UnresolvedMention">
+    <w:name w:val="Unresolved Mention"/>
+    <w:basedOn w:val="DefaultParagraphFont"/>
+    <w:uiPriority w:val="99"/>
+    <w:semiHidden/>
+    <w:unhideWhenUsed/>
+    <w:rsid w:val="005E59CC"/>
+    <w:rPr>
+      <w:color w:val="605E5C"/>
+      <w:shd w:val="clear" w:color="auto" w:fill="E1DFDD"/>
+    </w:rPr>
+  </w:style>
+  <w:style w:type="character" w:styleId="FollowedHyperlink">
+    <w:name w:val="FollowedHyperlink"/>
+    <w:basedOn w:val="DefaultParagraphFont"/>
+    <w:uiPriority w:val="99"/>
+    <w:semiHidden/>
+    <w:unhideWhenUsed/>
+    <w:rsid w:val="0059781E"/>
+    <w:rPr>
+      <w:color w:val="96607D" w:themeColor="followedHyperlink"/>
+      <w:u w:val="single"/>
     </w:rPr>
   </w:style>
 </w:styles>

</xml_diff>